<commit_message>
docs(governanca): resolve pendências herdadas da Spec 003
- teste ao vivo do MFA repetido depois da correção: 61 testes aprovados;
- leitor de tela dispensado, pois não será usado no projeto atual (validation.md, RIA-018, T083);
- DOCX do RIA-018 regenerado com o texto atualizado.

Co-Authored-By: Claude Sonnet 5.5 <noreply@anthropic.com>
</commit_message>
<xml_diff>
--- a/docs/governanca-ia/registros/18_Telas_e_Design_System_do_FluxID.docx
+++ b/docs/governanca-ia/registros/18_Telas_e_Design_System_do_FluxID.docx
@@ -841,7 +841,7 @@
                 <w:color w:val="000000"/>
                 <w:sz w:val="19"/>
               </w:rPr>
-              <w:t>O responsável pela spec, Alisson Almeida, validou o catálogo do design system e as telas de entrada, início, perfil e verificação em duas etapas no próprio sistema, com o Supabase local, usando Chrome no Windows 11 e sem leitor de tela. As demais telas foram conferidas por ele nas capturas de referência. Ao final ele declarou "tudo aprovado", inclusive a linha de base visual. Amostra: uma pessoa. A duração não foi informada. Ele não detalhou, item a item, o símbolo de 16 px, o piscar e o aparelho real, e não houve teste com leitor de tela nem confirmação de teste em aparelho real.</w:t>
+              <w:t>O responsável pela spec, Alisson Almeida, validou o catálogo do design system e as telas de entrada, início, perfil e verificação em duas etapas no próprio sistema, com o Supabase local, usando Chrome no Windows 11 e sem leitor de tela. As demais telas foram conferidas por ele nas capturas de referência. Ao final ele declarou "tudo aprovado", inclusive a linha de base visual. Amostra: uma pessoa. A duração não foi informada. Ele não detalhou, item a item, o símbolo de 16 px, o piscar e o aparelho real, e não houve confirmação de teste em aparelho real. O teste com leitor de tela foi dispensado por decisão do responsável: leitor de tela não será usado no projeto atual (01/10/2026).</w:t>
             </w:r>
           </w:p>
         </w:tc>
@@ -1235,7 +1235,7 @@
                 <w:color w:val="000000"/>
                 <w:sz w:val="19"/>
               </w:rPr>
-              <w:t>Link de validação trocado pelo do pull request #7 em 01/10/2026. Confirmar, quando houver oportunidade, o teste em aparelho real (teclado virtual, rede móvel lenta, paisagem) e com leitor de tela nas tabelas em cartão, que não foram feitos. Registrar a duração da validação humana, se for conhecida.</w:t>
+              <w:t>Link de validação trocado pelo do pull request #7 em 01/10/2026. Confirmar, quando houver oportunidade, o teste em aparelho real (teclado virtual, rede móvel lenta, paisagem), que não foi feito. Registrar a duração da validação humana, se for conhecida. Resolvido em 01/10/2026: o teste ao vivo do MFA foi repetido depois da correção (11 arquivos e 61 testes aprovados, depois de remover do banco local os fatores de teste dos usuários global e master); o leitor de tela foi dispensado, porque não será usado no projeto atual.</w:t>
             </w:r>
           </w:p>
         </w:tc>

</xml_diff>